<commit_message>
Adicição da lógica de mapear numero da coleta no pdf da pré compra
</commit_message>
<xml_diff>
--- a/backend/scripts/sgq/rnc-pdf/templates/rnc.docx
+++ b/backend/scripts/sgq/rnc-pdf/templates/rnc.docx
@@ -54,16 +54,16 @@
               <w:rPr>
                 <w:rFonts w:ascii="Arial" w:hAnsi="Arial" w:cs="Arial"/>
                 <w:b/>
-                <w:sz w:val="26"/>
-                <w:szCs w:val="26"/>
-              </w:rPr>
-            </w:pPr>
-            <w:r>
-              <w:rPr>
-                <w:rFonts w:ascii="Arial" w:hAnsi="Arial" w:cs="Arial"/>
-                <w:b/>
-                <w:sz w:val="26"/>
-                <w:szCs w:val="26"/>
+                <w:sz w:val="16"/>
+                <w:szCs w:val="16"/>
+              </w:rPr>
+            </w:pPr>
+            <w:r>
+              <w:rPr>
+                <w:rFonts w:ascii="Arial" w:hAnsi="Arial" w:cs="Arial"/>
+                <w:b/>
+                <w:sz w:val="16"/>
+                <w:szCs w:val="16"/>
               </w:rPr>
               <w:t xml:space="preserve">RELATÓRIO DE NÃO CONFORMIDADE </w:t>
             </w:r>
@@ -71,8 +71,8 @@
               <w:rPr>
                 <w:rFonts w:ascii="Arial" w:hAnsi="Arial" w:cs="Arial"/>
                 <w:b/>
-                <w:sz w:val="26"/>
-                <w:szCs w:val="26"/>
+                <w:sz w:val="16"/>
+                <w:szCs w:val="16"/>
               </w:rPr>
               <w:t>(RCC)</w:t>
             </w:r>
@@ -94,16 +94,16 @@
               <w:rPr>
                 <w:rFonts w:ascii="Arial" w:hAnsi="Arial" w:cs="Arial"/>
                 <w:b/>
-                <w:sz w:val="18"/>
-                <w:szCs w:val="18"/>
-              </w:rPr>
-            </w:pPr>
-            <w:r>
-              <w:rPr>
-                <w:rFonts w:ascii="Arial" w:hAnsi="Arial" w:cs="Arial"/>
-                <w:b/>
-                <w:sz w:val="18"/>
-                <w:szCs w:val="18"/>
+                <w:sz w:val="16"/>
+                <w:szCs w:val="16"/>
+              </w:rPr>
+            </w:pPr>
+            <w:r>
+              <w:rPr>
+                <w:rFonts w:ascii="Arial" w:hAnsi="Arial" w:cs="Arial"/>
+                <w:b/>
+                <w:sz w:val="16"/>
+                <w:szCs w:val="16"/>
               </w:rPr>
               <w:t xml:space="preserve">Nº </w:t>
             </w:r>
@@ -111,8 +111,8 @@
               <w:rPr>
                 <w:rFonts w:ascii="Arial" w:hAnsi="Arial" w:cs="Arial"/>
                 <w:b/>
-                <w:sz w:val="18"/>
-                <w:szCs w:val="18"/>
+                <w:sz w:val="16"/>
+                <w:szCs w:val="16"/>
               </w:rPr>
               <w:t>da RNC</w:t>
             </w:r>
@@ -120,8 +120,8 @@
               <w:rPr>
                 <w:rFonts w:ascii="Arial" w:hAnsi="Arial" w:cs="Arial"/>
                 <w:b/>
-                <w:sz w:val="18"/>
-                <w:szCs w:val="18"/>
+                <w:sz w:val="16"/>
+                <w:szCs w:val="16"/>
               </w:rPr>
               <w:t>:</w:t>
             </w:r>
@@ -139,8 +139,8 @@
               <w:rPr>
                 <w:rFonts w:ascii="Arial" w:hAnsi="Arial" w:cs="Arial"/>
                 <w:b/>
-                <w:sz w:val="18"/>
-                <w:szCs w:val="18"/>
+                <w:sz w:val="16"/>
+                <w:szCs w:val="16"/>
               </w:rPr>
             </w:pPr>
           </w:p>
@@ -157,16 +157,16 @@
               <w:rPr>
                 <w:rFonts w:ascii="Arial" w:hAnsi="Arial" w:cs="Arial"/>
                 <w:b/>
-                <w:sz w:val="18"/>
-                <w:szCs w:val="18"/>
-              </w:rPr>
-            </w:pPr>
-            <w:r>
-              <w:rPr>
-                <w:rFonts w:ascii="Arial" w:hAnsi="Arial" w:cs="Arial"/>
-                <w:b/>
-                <w:sz w:val="18"/>
-                <w:szCs w:val="18"/>
+                <w:sz w:val="16"/>
+                <w:szCs w:val="16"/>
+              </w:rPr>
+            </w:pPr>
+            <w:r>
+              <w:rPr>
+                <w:rFonts w:ascii="Arial" w:hAnsi="Arial" w:cs="Arial"/>
+                <w:b/>
+                <w:sz w:val="16"/>
+                <w:szCs w:val="16"/>
               </w:rPr>
               <w:t>Data do registro:</w:t>
             </w:r>
@@ -184,8 +184,8 @@
               <w:rPr>
                 <w:rFonts w:ascii="Arial" w:hAnsi="Arial" w:cs="Arial"/>
                 <w:b/>
-                <w:sz w:val="18"/>
-                <w:szCs w:val="18"/>
+                <w:sz w:val="16"/>
+                <w:szCs w:val="16"/>
               </w:rPr>
             </w:pPr>
           </w:p>
@@ -202,16 +202,16 @@
               <w:rPr>
                 <w:rFonts w:ascii="Arial" w:hAnsi="Arial" w:cs="Arial"/>
                 <w:b/>
-                <w:sz w:val="18"/>
-                <w:szCs w:val="18"/>
-              </w:rPr>
-            </w:pPr>
-            <w:r>
-              <w:rPr>
-                <w:rFonts w:ascii="Arial" w:hAnsi="Arial" w:cs="Arial"/>
-                <w:b/>
-                <w:sz w:val="18"/>
-                <w:szCs w:val="18"/>
+                <w:sz w:val="16"/>
+                <w:szCs w:val="16"/>
+              </w:rPr>
+            </w:pPr>
+            <w:r>
+              <w:rPr>
+                <w:rFonts w:ascii="Arial" w:hAnsi="Arial" w:cs="Arial"/>
+                <w:b/>
+                <w:sz w:val="16"/>
+                <w:szCs w:val="16"/>
               </w:rPr>
               <w:t>Data de fechamento:</w:t>
             </w:r>
@@ -230,8 +230,8 @@
               <w:rPr>
                 <w:rFonts w:ascii="Arial" w:hAnsi="Arial" w:cs="Arial"/>
                 <w:bCs/>
-                <w:sz w:val="18"/>
-                <w:szCs w:val="18"/>
+                <w:sz w:val="16"/>
+                <w:szCs w:val="16"/>
               </w:rPr>
             </w:pPr>
           </w:p>
@@ -248,16 +248,16 @@
               <w:rPr>
                 <w:rFonts w:ascii="Arial" w:hAnsi="Arial" w:cs="Arial"/>
                 <w:b/>
-                <w:sz w:val="18"/>
-                <w:szCs w:val="18"/>
-              </w:rPr>
-            </w:pPr>
-            <w:r>
-              <w:rPr>
-                <w:rFonts w:ascii="Arial" w:hAnsi="Arial" w:cs="Arial"/>
-                <w:b/>
-                <w:sz w:val="18"/>
-                <w:szCs w:val="18"/>
+                <w:sz w:val="16"/>
+                <w:szCs w:val="16"/>
+              </w:rPr>
+            </w:pPr>
+            <w:r>
+              <w:rPr>
+                <w:rFonts w:ascii="Arial" w:hAnsi="Arial" w:cs="Arial"/>
+                <w:b/>
+                <w:sz w:val="16"/>
+                <w:szCs w:val="16"/>
               </w:rPr>
               <w:t>Status atual:</w:t>
             </w:r>
@@ -275,8 +275,8 @@
               <w:rPr>
                 <w:rFonts w:ascii="Arial" w:hAnsi="Arial" w:cs="Arial"/>
                 <w:b/>
-                <w:sz w:val="18"/>
-                <w:szCs w:val="18"/>
+                <w:sz w:val="16"/>
+                <w:szCs w:val="16"/>
               </w:rPr>
             </w:pPr>
           </w:p>
@@ -300,17 +300,17 @@
               <w:rPr>
                 <w:rFonts w:ascii="Arial" w:hAnsi="Arial" w:cs="Arial"/>
                 <w:bCs/>
-                <w:sz w:val="18"/>
-                <w:szCs w:val="18"/>
-              </w:rPr>
-            </w:pPr>
-            <w:r>
-              <w:rPr>
-                <w:rFonts w:ascii="Arial" w:hAnsi="Arial" w:cs="Arial"/>
-                <w:b/>
-                <w:bCs/>
-                <w:sz w:val="18"/>
-                <w:szCs w:val="18"/>
+                <w:sz w:val="16"/>
+                <w:szCs w:val="16"/>
+              </w:rPr>
+            </w:pPr>
+            <w:r>
+              <w:rPr>
+                <w:rFonts w:ascii="Arial" w:hAnsi="Arial" w:cs="Arial"/>
+                <w:b/>
+                <w:bCs/>
+                <w:sz w:val="16"/>
+                <w:szCs w:val="16"/>
               </w:rPr>
               <w:t>IDENTIFICAÇÃO DO CLIENTE</w:t>
             </w:r>
@@ -332,66 +332,37 @@
               <w:rPr>
                 <w:rFonts w:ascii="Arial" w:hAnsi="Arial" w:cs="Arial"/>
                 <w:b/>
-                <w:sz w:val="18"/>
-                <w:szCs w:val="18"/>
-              </w:rPr>
-            </w:pPr>
-            <w:r>
-              <w:rPr>
-                <w:rFonts w:ascii="Arial" w:hAnsi="Arial" w:cs="Arial"/>
-                <w:b/>
-                <w:sz w:val="18"/>
-                <w:szCs w:val="18"/>
-              </w:rPr>
-              <w:t>Tipo de ação:</w:t>
-            </w:r>
-          </w:p>
-        </w:tc>
-        <w:tc>
-          <w:tcPr>
-            <w:tcW w:w="1701" w:type="dxa"/>
-            <w:gridSpan w:val="4"/>
-            <w:vAlign w:val="center"/>
-          </w:tcPr>
-          <w:p>
-            <w:pPr>
-              <w:ind w:left="-129"/>
-              <w:jc w:val="center"/>
-              <w:rPr>
-                <w:rFonts w:ascii="Arial" w:hAnsi="Arial" w:cs="Arial"/>
-                <w:bCs/>
-                <w:sz w:val="18"/>
-                <w:szCs w:val="18"/>
-              </w:rPr>
-            </w:pPr>
-          </w:p>
-        </w:tc>
-        <w:tc>
-          <w:tcPr>
-            <w:tcW w:w="1701" w:type="dxa"/>
-            <w:gridSpan w:val="3"/>
-            <w:vAlign w:val="center"/>
-          </w:tcPr>
-          <w:p>
-            <w:pPr>
-              <w:ind w:left="-129"/>
-              <w:jc w:val="center"/>
-              <w:rPr>
-                <w:rFonts w:ascii="Arial" w:hAnsi="Arial" w:cs="Arial"/>
-                <w:bCs/>
-                <w:sz w:val="18"/>
-                <w:szCs w:val="18"/>
-              </w:rPr>
-            </w:pPr>
-            <w:r>
-              <w:rPr>
-                <w:rFonts w:ascii="Arial" w:hAnsi="Arial" w:cs="Arial"/>
-                <w:b/>
-                <w:sz w:val="18"/>
-                <w:szCs w:val="18"/>
-              </w:rPr>
-              <w:t>Tipo de ocorrência:</w:t>
-            </w:r>
+                <w:sz w:val="16"/>
+                <w:szCs w:val="16"/>
+              </w:rPr>
+            </w:pPr>
+            <w:r>
+              <w:rPr>
+                <w:rFonts w:ascii="Arial" w:hAnsi="Arial" w:cs="Arial"/>
+                <w:b/>
+                <w:sz w:val="16"/>
+                <w:szCs w:val="16"/>
+              </w:rPr>
+              <w:t>Cód. Produto:</w:t>
+            </w:r>
+          </w:p>
+        </w:tc>
+        <w:tc>
+          <w:tcPr>
+            <w:tcW w:w="3402" w:type="dxa"/>
+            <w:gridSpan w:val="7"/>
+            <w:vAlign w:val="center"/>
+          </w:tcPr>
+          <w:p>
+            <w:pPr>
+              <w:ind w:left="-129"/>
+              <w:rPr>
+                <w:rFonts w:ascii="Arial" w:hAnsi="Arial" w:cs="Arial"/>
+                <w:b/>
+                <w:sz w:val="16"/>
+                <w:szCs w:val="16"/>
+              </w:rPr>
+            </w:pPr>
           </w:p>
         </w:tc>
         <w:tc>
@@ -406,66 +377,37 @@
               <w:jc w:val="center"/>
               <w:rPr>
                 <w:rFonts w:ascii="Arial" w:hAnsi="Arial" w:cs="Arial"/>
-                <w:bCs/>
-                <w:sz w:val="18"/>
-                <w:szCs w:val="18"/>
-              </w:rPr>
-            </w:pPr>
-          </w:p>
-        </w:tc>
-        <w:tc>
-          <w:tcPr>
-            <w:tcW w:w="1276" w:type="dxa"/>
-            <w:vAlign w:val="center"/>
-          </w:tcPr>
-          <w:p>
-            <w:pPr>
-              <w:ind w:left="-129"/>
-              <w:jc w:val="center"/>
-              <w:rPr>
-                <w:rFonts w:ascii="Arial" w:hAnsi="Arial" w:cs="Arial"/>
-                <w:b/>
-                <w:sz w:val="18"/>
-                <w:szCs w:val="18"/>
-              </w:rPr>
-            </w:pPr>
-            <w:proofErr w:type="spellStart"/>
-            <w:r>
-              <w:rPr>
-                <w:rFonts w:ascii="Arial" w:hAnsi="Arial" w:cs="Arial"/>
-                <w:b/>
-                <w:sz w:val="18"/>
-                <w:szCs w:val="18"/>
-              </w:rPr>
-              <w:t>Qtde</w:t>
-            </w:r>
-            <w:proofErr w:type="spellEnd"/>
-            <w:r>
-              <w:rPr>
-                <w:rFonts w:ascii="Arial" w:hAnsi="Arial" w:cs="Arial"/>
-                <w:b/>
-                <w:sz w:val="18"/>
-                <w:szCs w:val="18"/>
-              </w:rPr>
-              <w:t>:</w:t>
-            </w:r>
-          </w:p>
-        </w:tc>
-        <w:tc>
-          <w:tcPr>
-            <w:tcW w:w="3260" w:type="dxa"/>
-            <w:gridSpan w:val="4"/>
-            <w:vAlign w:val="center"/>
-          </w:tcPr>
-          <w:p>
-            <w:pPr>
-              <w:ind w:left="-129"/>
-              <w:jc w:val="center"/>
-              <w:rPr>
-                <w:rFonts w:ascii="Arial" w:hAnsi="Arial" w:cs="Arial"/>
-                <w:bCs/>
-                <w:sz w:val="18"/>
-                <w:szCs w:val="18"/>
+                <w:b/>
+                <w:sz w:val="16"/>
+                <w:szCs w:val="16"/>
+              </w:rPr>
+            </w:pPr>
+            <w:r>
+              <w:rPr>
+                <w:rFonts w:ascii="Arial" w:hAnsi="Arial" w:cs="Arial"/>
+                <w:b/>
+                <w:sz w:val="16"/>
+                <w:szCs w:val="16"/>
+              </w:rPr>
+              <w:t>Descrição Produto:</w:t>
+            </w:r>
+          </w:p>
+        </w:tc>
+        <w:tc>
+          <w:tcPr>
+            <w:tcW w:w="4536" w:type="dxa"/>
+            <w:gridSpan w:val="5"/>
+            <w:vAlign w:val="center"/>
+          </w:tcPr>
+          <w:p>
+            <w:pPr>
+              <w:ind w:left="-129"/>
+              <w:jc w:val="center"/>
+              <w:rPr>
+                <w:rFonts w:ascii="Arial" w:hAnsi="Arial" w:cs="Arial"/>
+                <w:bCs/>
+                <w:sz w:val="16"/>
+                <w:szCs w:val="16"/>
               </w:rPr>
             </w:pPr>
           </w:p>
@@ -478,6 +420,160 @@
         <w:tc>
           <w:tcPr>
             <w:tcW w:w="1555" w:type="dxa"/>
+            <w:vAlign w:val="center"/>
+          </w:tcPr>
+          <w:p>
+            <w:pPr>
+              <w:jc w:val="center"/>
+              <w:rPr>
+                <w:rFonts w:ascii="Arial" w:hAnsi="Arial" w:cs="Arial"/>
+                <w:b/>
+                <w:sz w:val="16"/>
+                <w:szCs w:val="16"/>
+              </w:rPr>
+            </w:pPr>
+            <w:r>
+              <w:rPr>
+                <w:rFonts w:ascii="Arial" w:hAnsi="Arial" w:cs="Arial"/>
+                <w:b/>
+                <w:sz w:val="16"/>
+                <w:szCs w:val="16"/>
+              </w:rPr>
+              <w:t>Tipo de ação:</w:t>
+            </w:r>
+          </w:p>
+        </w:tc>
+        <w:tc>
+          <w:tcPr>
+            <w:tcW w:w="1701" w:type="dxa"/>
+            <w:gridSpan w:val="4"/>
+            <w:vAlign w:val="center"/>
+          </w:tcPr>
+          <w:p>
+            <w:pPr>
+              <w:ind w:left="-129"/>
+              <w:jc w:val="center"/>
+              <w:rPr>
+                <w:rFonts w:ascii="Arial" w:hAnsi="Arial" w:cs="Arial"/>
+                <w:bCs/>
+                <w:sz w:val="16"/>
+                <w:szCs w:val="16"/>
+              </w:rPr>
+            </w:pPr>
+          </w:p>
+        </w:tc>
+        <w:tc>
+          <w:tcPr>
+            <w:tcW w:w="1701" w:type="dxa"/>
+            <w:gridSpan w:val="3"/>
+            <w:vAlign w:val="center"/>
+          </w:tcPr>
+          <w:p>
+            <w:pPr>
+              <w:ind w:left="-129"/>
+              <w:jc w:val="center"/>
+              <w:rPr>
+                <w:rFonts w:ascii="Arial" w:hAnsi="Arial" w:cs="Arial"/>
+                <w:bCs/>
+                <w:sz w:val="16"/>
+                <w:szCs w:val="16"/>
+              </w:rPr>
+            </w:pPr>
+            <w:r>
+              <w:rPr>
+                <w:rFonts w:ascii="Arial" w:hAnsi="Arial" w:cs="Arial"/>
+                <w:b/>
+                <w:sz w:val="16"/>
+                <w:szCs w:val="16"/>
+              </w:rPr>
+              <w:t>Tipo de ocorrência:</w:t>
+            </w:r>
+          </w:p>
+        </w:tc>
+        <w:tc>
+          <w:tcPr>
+            <w:tcW w:w="2126" w:type="dxa"/>
+            <w:gridSpan w:val="4"/>
+            <w:vAlign w:val="center"/>
+          </w:tcPr>
+          <w:p>
+            <w:pPr>
+              <w:ind w:left="-129"/>
+              <w:jc w:val="center"/>
+              <w:rPr>
+                <w:rFonts w:ascii="Arial" w:hAnsi="Arial" w:cs="Arial"/>
+                <w:bCs/>
+                <w:sz w:val="16"/>
+                <w:szCs w:val="16"/>
+              </w:rPr>
+            </w:pPr>
+          </w:p>
+        </w:tc>
+        <w:tc>
+          <w:tcPr>
+            <w:tcW w:w="1276" w:type="dxa"/>
+            <w:vAlign w:val="center"/>
+          </w:tcPr>
+          <w:p>
+            <w:pPr>
+              <w:ind w:left="-129"/>
+              <w:jc w:val="center"/>
+              <w:rPr>
+                <w:rFonts w:ascii="Arial" w:hAnsi="Arial" w:cs="Arial"/>
+                <w:b/>
+                <w:sz w:val="16"/>
+                <w:szCs w:val="16"/>
+              </w:rPr>
+            </w:pPr>
+            <w:proofErr w:type="spellStart"/>
+            <w:r>
+              <w:rPr>
+                <w:rFonts w:ascii="Arial" w:hAnsi="Arial" w:cs="Arial"/>
+                <w:b/>
+                <w:sz w:val="16"/>
+                <w:szCs w:val="16"/>
+              </w:rPr>
+              <w:t>Qtde</w:t>
+            </w:r>
+            <w:proofErr w:type="spellEnd"/>
+            <w:r>
+              <w:rPr>
+                <w:rFonts w:ascii="Arial" w:hAnsi="Arial" w:cs="Arial"/>
+                <w:b/>
+                <w:sz w:val="16"/>
+                <w:szCs w:val="16"/>
+              </w:rPr>
+              <w:t>:</w:t>
+            </w:r>
+          </w:p>
+        </w:tc>
+        <w:tc>
+          <w:tcPr>
+            <w:tcW w:w="3260" w:type="dxa"/>
+            <w:gridSpan w:val="4"/>
+            <w:vAlign w:val="center"/>
+          </w:tcPr>
+          <w:p>
+            <w:pPr>
+              <w:ind w:left="-129"/>
+              <w:jc w:val="center"/>
+              <w:rPr>
+                <w:rFonts w:ascii="Arial" w:hAnsi="Arial" w:cs="Arial"/>
+                <w:bCs/>
+                <w:sz w:val="16"/>
+                <w:szCs w:val="16"/>
+              </w:rPr>
+            </w:pPr>
+          </w:p>
+        </w:tc>
+      </w:tr>
+      <w:tr>
+        <w:trPr>
+          <w:trHeight w:val="409"/>
+        </w:trPr>
+        <w:tc>
+          <w:tcPr>
+            <w:tcW w:w="1555" w:type="dxa"/>
             <w:tcBorders>
               <w:bottom w:val="single" w:sz="4" w:space="0" w:color="auto"/>
             </w:tcBorders>
@@ -489,16 +585,16 @@
               <w:rPr>
                 <w:rFonts w:ascii="Arial" w:hAnsi="Arial" w:cs="Arial"/>
                 <w:b/>
-                <w:sz w:val="18"/>
-                <w:szCs w:val="18"/>
-              </w:rPr>
-            </w:pPr>
-            <w:r>
-              <w:rPr>
-                <w:rFonts w:ascii="Arial" w:hAnsi="Arial" w:cs="Arial"/>
-                <w:b/>
-                <w:sz w:val="18"/>
-                <w:szCs w:val="18"/>
+                <w:sz w:val="16"/>
+                <w:szCs w:val="16"/>
+              </w:rPr>
+            </w:pPr>
+            <w:r>
+              <w:rPr>
+                <w:rFonts w:ascii="Arial" w:hAnsi="Arial" w:cs="Arial"/>
+                <w:b/>
+                <w:sz w:val="16"/>
+                <w:szCs w:val="16"/>
               </w:rPr>
               <w:t>Setor de ocorrência:</w:t>
             </w:r>
@@ -517,8 +613,8 @@
               <w:rPr>
                 <w:rFonts w:ascii="Arial" w:hAnsi="Arial" w:cs="Arial"/>
                 <w:bCs/>
-                <w:sz w:val="18"/>
-                <w:szCs w:val="18"/>
+                <w:sz w:val="16"/>
+                <w:szCs w:val="16"/>
               </w:rPr>
             </w:pPr>
           </w:p>
@@ -536,16 +632,16 @@
               <w:rPr>
                 <w:rFonts w:ascii="Arial" w:hAnsi="Arial" w:cs="Arial"/>
                 <w:bCs/>
-                <w:sz w:val="18"/>
-                <w:szCs w:val="18"/>
-              </w:rPr>
-            </w:pPr>
-            <w:r>
-              <w:rPr>
-                <w:rFonts w:ascii="Arial" w:hAnsi="Arial" w:cs="Arial"/>
-                <w:b/>
-                <w:sz w:val="18"/>
-                <w:szCs w:val="18"/>
+                <w:sz w:val="16"/>
+                <w:szCs w:val="16"/>
+              </w:rPr>
+            </w:pPr>
+            <w:r>
+              <w:rPr>
+                <w:rFonts w:ascii="Arial" w:hAnsi="Arial" w:cs="Arial"/>
+                <w:b/>
+                <w:sz w:val="16"/>
+                <w:szCs w:val="16"/>
               </w:rPr>
               <w:t>Setor de Detecção:</w:t>
             </w:r>
@@ -564,8 +660,8 @@
               <w:rPr>
                 <w:rFonts w:ascii="Arial" w:hAnsi="Arial" w:cs="Arial"/>
                 <w:bCs/>
-                <w:sz w:val="18"/>
-                <w:szCs w:val="18"/>
+                <w:sz w:val="16"/>
+                <w:szCs w:val="16"/>
               </w:rPr>
             </w:pPr>
           </w:p>
@@ -585,16 +681,16 @@
               <w:rPr>
                 <w:rFonts w:ascii="Arial" w:hAnsi="Arial" w:cs="Arial"/>
                 <w:b/>
-                <w:sz w:val="18"/>
-                <w:szCs w:val="18"/>
-              </w:rPr>
-            </w:pPr>
-            <w:r>
-              <w:rPr>
-                <w:rFonts w:ascii="Arial" w:hAnsi="Arial" w:cs="Arial"/>
-                <w:b/>
-                <w:sz w:val="18"/>
-                <w:szCs w:val="18"/>
+                <w:sz w:val="16"/>
+                <w:szCs w:val="16"/>
+              </w:rPr>
+            </w:pPr>
+            <w:r>
+              <w:rPr>
+                <w:rFonts w:ascii="Arial" w:hAnsi="Arial" w:cs="Arial"/>
+                <w:b/>
+                <w:sz w:val="16"/>
+                <w:szCs w:val="16"/>
               </w:rPr>
               <w:t>Lote/Série:</w:t>
             </w:r>
@@ -606,8 +702,8 @@
               <w:rPr>
                 <w:rFonts w:ascii="Arial" w:hAnsi="Arial" w:cs="Arial"/>
                 <w:b/>
-                <w:sz w:val="18"/>
-                <w:szCs w:val="18"/>
+                <w:sz w:val="16"/>
+                <w:szCs w:val="16"/>
               </w:rPr>
             </w:pPr>
           </w:p>
@@ -628,8 +724,8 @@
               <w:rPr>
                 <w:rFonts w:ascii="Arial" w:hAnsi="Arial" w:cs="Arial"/>
                 <w:bCs/>
-                <w:sz w:val="18"/>
-                <w:szCs w:val="18"/>
+                <w:sz w:val="16"/>
+                <w:szCs w:val="16"/>
               </w:rPr>
             </w:pPr>
           </w:p>
@@ -653,16 +749,16 @@
               <w:rPr>
                 <w:rFonts w:ascii="Arial" w:hAnsi="Arial" w:cs="Arial"/>
                 <w:b/>
-                <w:sz w:val="18"/>
-                <w:szCs w:val="18"/>
-              </w:rPr>
-            </w:pPr>
-            <w:r>
-              <w:rPr>
-                <w:rFonts w:ascii="Arial" w:hAnsi="Arial" w:cs="Arial"/>
-                <w:b/>
-                <w:sz w:val="18"/>
-                <w:szCs w:val="18"/>
+                <w:sz w:val="16"/>
+                <w:szCs w:val="16"/>
+              </w:rPr>
+            </w:pPr>
+            <w:r>
+              <w:rPr>
+                <w:rFonts w:ascii="Arial" w:hAnsi="Arial" w:cs="Arial"/>
+                <w:b/>
+                <w:sz w:val="16"/>
+                <w:szCs w:val="16"/>
               </w:rPr>
               <w:t>Grupo de Produto:</w:t>
             </w:r>
@@ -684,8 +780,8 @@
               <w:rPr>
                 <w:rFonts w:ascii="Arial" w:hAnsi="Arial" w:cs="Arial"/>
                 <w:bCs/>
-                <w:sz w:val="18"/>
-                <w:szCs w:val="18"/>
+                <w:sz w:val="16"/>
+                <w:szCs w:val="16"/>
               </w:rPr>
             </w:pPr>
           </w:p>
@@ -706,16 +802,16 @@
               <w:rPr>
                 <w:rFonts w:ascii="Arial" w:hAnsi="Arial" w:cs="Arial"/>
                 <w:bCs/>
-                <w:sz w:val="18"/>
-                <w:szCs w:val="18"/>
-              </w:rPr>
-            </w:pPr>
-            <w:r>
-              <w:rPr>
-                <w:rFonts w:ascii="Arial" w:hAnsi="Arial" w:cs="Arial"/>
-                <w:b/>
-                <w:sz w:val="18"/>
-                <w:szCs w:val="18"/>
+                <w:sz w:val="16"/>
+                <w:szCs w:val="16"/>
+              </w:rPr>
+            </w:pPr>
+            <w:r>
+              <w:rPr>
+                <w:rFonts w:ascii="Arial" w:hAnsi="Arial" w:cs="Arial"/>
+                <w:b/>
+                <w:sz w:val="16"/>
+                <w:szCs w:val="16"/>
               </w:rPr>
               <w:t>O.P. Nº:</w:t>
             </w:r>
@@ -737,8 +833,8 @@
               <w:rPr>
                 <w:rFonts w:ascii="Arial" w:hAnsi="Arial" w:cs="Arial"/>
                 <w:bCs/>
-                <w:sz w:val="18"/>
-                <w:szCs w:val="18"/>
+                <w:sz w:val="16"/>
+                <w:szCs w:val="16"/>
               </w:rPr>
             </w:pPr>
           </w:p>
@@ -758,16 +854,16 @@
               <w:rPr>
                 <w:rFonts w:ascii="Arial" w:hAnsi="Arial" w:cs="Arial"/>
                 <w:b/>
-                <w:sz w:val="18"/>
-                <w:szCs w:val="18"/>
-              </w:rPr>
-            </w:pPr>
-            <w:r>
-              <w:rPr>
-                <w:rFonts w:ascii="Arial" w:hAnsi="Arial" w:cs="Arial"/>
-                <w:b/>
-                <w:sz w:val="18"/>
-                <w:szCs w:val="18"/>
+                <w:sz w:val="16"/>
+                <w:szCs w:val="16"/>
+              </w:rPr>
+            </w:pPr>
+            <w:r>
+              <w:rPr>
+                <w:rFonts w:ascii="Arial" w:hAnsi="Arial" w:cs="Arial"/>
+                <w:b/>
+                <w:sz w:val="16"/>
+                <w:szCs w:val="16"/>
               </w:rPr>
               <w:t>Nota Fiscal:</w:t>
             </w:r>
@@ -789,8 +885,8 @@
               <w:rPr>
                 <w:rFonts w:ascii="Arial" w:hAnsi="Arial" w:cs="Arial"/>
                 <w:bCs/>
-                <w:sz w:val="18"/>
-                <w:szCs w:val="18"/>
+                <w:sz w:val="16"/>
+                <w:szCs w:val="16"/>
               </w:rPr>
             </w:pPr>
           </w:p>
@@ -818,17 +914,17 @@
                 <w:rFonts w:ascii="Arial" w:hAnsi="Arial" w:cs="Arial"/>
                 <w:b/>
                 <w:bCs/>
-                <w:sz w:val="18"/>
-                <w:szCs w:val="18"/>
-              </w:rPr>
-            </w:pPr>
-            <w:r>
-              <w:rPr>
-                <w:rFonts w:ascii="Arial" w:hAnsi="Arial" w:cs="Arial"/>
-                <w:b/>
-                <w:bCs/>
-                <w:sz w:val="18"/>
-                <w:szCs w:val="18"/>
+                <w:sz w:val="16"/>
+                <w:szCs w:val="16"/>
+              </w:rPr>
+            </w:pPr>
+            <w:r>
+              <w:rPr>
+                <w:rFonts w:ascii="Arial" w:hAnsi="Arial" w:cs="Arial"/>
+                <w:b/>
+                <w:bCs/>
+                <w:sz w:val="16"/>
+                <w:szCs w:val="16"/>
               </w:rPr>
               <w:t>DESCRIÇÃO DA OCORRÊNCIA</w:t>
             </w:r>
@@ -853,8 +949,8 @@
               <w:rPr>
                 <w:rFonts w:ascii="Arial" w:hAnsi="Arial" w:cs="Arial"/>
                 <w:b/>
-                <w:sz w:val="18"/>
-                <w:szCs w:val="18"/>
+                <w:sz w:val="16"/>
+                <w:szCs w:val="16"/>
               </w:rPr>
             </w:pPr>
           </w:p>
@@ -879,17 +975,17 @@
                 <w:rFonts w:ascii="Arial" w:hAnsi="Arial" w:cs="Arial"/>
                 <w:b/>
                 <w:bCs/>
-                <w:sz w:val="18"/>
-                <w:szCs w:val="18"/>
-              </w:rPr>
-            </w:pPr>
-            <w:r>
-              <w:rPr>
-                <w:rFonts w:ascii="Arial" w:hAnsi="Arial" w:cs="Arial"/>
-                <w:b/>
-                <w:bCs/>
-                <w:sz w:val="18"/>
-                <w:szCs w:val="18"/>
+                <w:sz w:val="16"/>
+                <w:szCs w:val="16"/>
+              </w:rPr>
+            </w:pPr>
+            <w:r>
+              <w:rPr>
+                <w:rFonts w:ascii="Arial" w:hAnsi="Arial" w:cs="Arial"/>
+                <w:b/>
+                <w:bCs/>
+                <w:sz w:val="16"/>
+                <w:szCs w:val="16"/>
               </w:rPr>
               <w:t xml:space="preserve">Preenchido por:  </w:t>
             </w:r>
@@ -910,8 +1006,8 @@
                 <w:rFonts w:ascii="Arial" w:hAnsi="Arial" w:cs="Arial"/>
                 <w:b/>
                 <w:bCs/>
-                <w:sz w:val="18"/>
-                <w:szCs w:val="18"/>
+                <w:sz w:val="16"/>
+                <w:szCs w:val="16"/>
               </w:rPr>
             </w:pPr>
           </w:p>
@@ -931,8 +1027,8 @@
                 <w:b/>
                 <w:bCs/>
                 <w:noProof/>
-                <w:sz w:val="18"/>
-                <w:szCs w:val="18"/>
+                <w:sz w:val="16"/>
+                <w:szCs w:val="16"/>
               </w:rPr>
             </w:pPr>
             <w:r>
@@ -941,21 +1037,10 @@
                 <w:b/>
                 <w:bCs/>
                 <w:noProof/>
-                <w:sz w:val="18"/>
-                <w:szCs w:val="18"/>
-              </w:rPr>
-              <w:t>Data  da ocorrência</w:t>
-            </w:r>
-            <w:r>
-              <w:rPr>
-                <w:rFonts w:ascii="Arial" w:hAnsi="Arial" w:cs="Arial"/>
-                <w:b/>
-                <w:bCs/>
-                <w:noProof/>
-                <w:sz w:val="18"/>
-                <w:szCs w:val="18"/>
-              </w:rPr>
-              <w:t>:</w:t>
+                <w:sz w:val="16"/>
+                <w:szCs w:val="16"/>
+              </w:rPr>
+              <w:t>Data  da ocorrência:</w:t>
             </w:r>
           </w:p>
         </w:tc>
@@ -974,8 +1059,8 @@
                 <w:rFonts w:ascii="Arial" w:hAnsi="Arial" w:cs="Arial"/>
                 <w:b/>
                 <w:bCs/>
-                <w:sz w:val="18"/>
-                <w:szCs w:val="18"/>
+                <w:sz w:val="16"/>
+                <w:szCs w:val="16"/>
               </w:rPr>
             </w:pPr>
           </w:p>
@@ -1000,8 +1085,8 @@
                 <w:rFonts w:ascii="Arial" w:hAnsi="Arial" w:cs="Arial"/>
                 <w:b/>
                 <w:bCs/>
-                <w:sz w:val="18"/>
-                <w:szCs w:val="18"/>
+                <w:sz w:val="16"/>
+                <w:szCs w:val="16"/>
               </w:rPr>
             </w:pPr>
           </w:p>
@@ -1026,17 +1111,17 @@
                 <w:rFonts w:ascii="Arial" w:hAnsi="Arial" w:cs="Arial"/>
                 <w:b/>
                 <w:bCs/>
-                <w:sz w:val="18"/>
-                <w:szCs w:val="18"/>
-              </w:rPr>
-            </w:pPr>
-            <w:r>
-              <w:rPr>
-                <w:rFonts w:ascii="Arial" w:hAnsi="Arial" w:cs="Arial"/>
-                <w:b/>
-                <w:bCs/>
-                <w:sz w:val="18"/>
-                <w:szCs w:val="18"/>
+                <w:sz w:val="16"/>
+                <w:szCs w:val="16"/>
+              </w:rPr>
+            </w:pPr>
+            <w:r>
+              <w:rPr>
+                <w:rFonts w:ascii="Arial" w:hAnsi="Arial" w:cs="Arial"/>
+                <w:b/>
+                <w:bCs/>
+                <w:sz w:val="16"/>
+                <w:szCs w:val="16"/>
               </w:rPr>
               <w:t>AÇÃO IMEDIATA</w:t>
             </w:r>
@@ -1045,8 +1130,8 @@
                 <w:rFonts w:ascii="Arial" w:hAnsi="Arial" w:cs="Arial"/>
                 <w:b/>
                 <w:bCs/>
-                <w:sz w:val="18"/>
-                <w:szCs w:val="18"/>
+                <w:sz w:val="16"/>
+                <w:szCs w:val="16"/>
               </w:rPr>
               <w:t>:</w:t>
             </w:r>
@@ -1067,8 +1152,8 @@
                 <w:rFonts w:ascii="Arial" w:hAnsi="Arial" w:cs="Arial"/>
                 <w:b/>
                 <w:bCs/>
-                <w:sz w:val="18"/>
-                <w:szCs w:val="18"/>
+                <w:sz w:val="16"/>
+                <w:szCs w:val="16"/>
               </w:rPr>
             </w:pPr>
           </w:p>
@@ -1093,17 +1178,17 @@
                 <w:rFonts w:ascii="Arial" w:hAnsi="Arial" w:cs="Arial"/>
                 <w:b/>
                 <w:bCs/>
-                <w:sz w:val="18"/>
-                <w:szCs w:val="18"/>
-              </w:rPr>
-            </w:pPr>
-            <w:r>
-              <w:rPr>
-                <w:rFonts w:ascii="Arial" w:hAnsi="Arial" w:cs="Arial"/>
-                <w:b/>
-                <w:bCs/>
-                <w:sz w:val="18"/>
-                <w:szCs w:val="18"/>
+                <w:sz w:val="16"/>
+                <w:szCs w:val="16"/>
+              </w:rPr>
+            </w:pPr>
+            <w:r>
+              <w:rPr>
+                <w:rFonts w:ascii="Arial" w:hAnsi="Arial" w:cs="Arial"/>
+                <w:b/>
+                <w:bCs/>
+                <w:sz w:val="16"/>
+                <w:szCs w:val="16"/>
               </w:rPr>
               <w:t>DESCRIÇÃO DA AÇÃO IMEDIATA</w:t>
             </w:r>
@@ -1129,8 +1214,8 @@
                 <w:rFonts w:ascii="Arial" w:hAnsi="Arial" w:cs="Arial"/>
                 <w:b/>
                 <w:bCs/>
-                <w:sz w:val="18"/>
-                <w:szCs w:val="18"/>
+                <w:sz w:val="16"/>
+                <w:szCs w:val="16"/>
               </w:rPr>
             </w:pPr>
           </w:p>
@@ -1155,17 +1240,17 @@
                 <w:rFonts w:ascii="Arial" w:hAnsi="Arial" w:cs="Arial"/>
                 <w:b/>
                 <w:bCs/>
-                <w:sz w:val="18"/>
-                <w:szCs w:val="18"/>
-              </w:rPr>
-            </w:pPr>
-            <w:r>
-              <w:rPr>
-                <w:rFonts w:ascii="Arial" w:hAnsi="Arial" w:cs="Arial"/>
-                <w:b/>
-                <w:bCs/>
-                <w:sz w:val="18"/>
-                <w:szCs w:val="18"/>
+                <w:sz w:val="16"/>
+                <w:szCs w:val="16"/>
+              </w:rPr>
+            </w:pPr>
+            <w:r>
+              <w:rPr>
+                <w:rFonts w:ascii="Arial" w:hAnsi="Arial" w:cs="Arial"/>
+                <w:b/>
+                <w:bCs/>
+                <w:sz w:val="16"/>
+                <w:szCs w:val="16"/>
               </w:rPr>
               <w:t>Responsável pela ação imediata:</w:t>
             </w:r>
@@ -1186,8 +1271,8 @@
                 <w:rFonts w:ascii="Arial" w:hAnsi="Arial" w:cs="Arial"/>
                 <w:b/>
                 <w:bCs/>
-                <w:sz w:val="18"/>
-                <w:szCs w:val="18"/>
+                <w:sz w:val="16"/>
+                <w:szCs w:val="16"/>
               </w:rPr>
             </w:pPr>
           </w:p>
@@ -1207,17 +1292,17 @@
                 <w:rFonts w:ascii="Arial" w:hAnsi="Arial" w:cs="Arial"/>
                 <w:b/>
                 <w:bCs/>
-                <w:sz w:val="18"/>
-                <w:szCs w:val="18"/>
-              </w:rPr>
-            </w:pPr>
-            <w:r>
-              <w:rPr>
-                <w:rFonts w:ascii="Arial" w:hAnsi="Arial" w:cs="Arial"/>
-                <w:b/>
-                <w:bCs/>
-                <w:sz w:val="18"/>
-                <w:szCs w:val="18"/>
+                <w:sz w:val="16"/>
+                <w:szCs w:val="16"/>
+              </w:rPr>
+            </w:pPr>
+            <w:r>
+              <w:rPr>
+                <w:rFonts w:ascii="Arial" w:hAnsi="Arial" w:cs="Arial"/>
+                <w:b/>
+                <w:bCs/>
+                <w:sz w:val="16"/>
+                <w:szCs w:val="16"/>
               </w:rPr>
               <w:t>Prazo de execução:</w:t>
             </w:r>
@@ -1238,8 +1323,8 @@
                 <w:rFonts w:ascii="Arial" w:hAnsi="Arial" w:cs="Arial"/>
                 <w:b/>
                 <w:bCs/>
-                <w:sz w:val="18"/>
-                <w:szCs w:val="18"/>
+                <w:sz w:val="16"/>
+                <w:szCs w:val="16"/>
               </w:rPr>
             </w:pPr>
           </w:p>
@@ -1264,17 +1349,17 @@
                 <w:rFonts w:ascii="Arial" w:hAnsi="Arial" w:cs="Arial"/>
                 <w:b/>
                 <w:bCs/>
-                <w:sz w:val="18"/>
-                <w:szCs w:val="18"/>
-              </w:rPr>
-            </w:pPr>
-            <w:r>
-              <w:rPr>
-                <w:rFonts w:ascii="Arial" w:hAnsi="Arial" w:cs="Arial"/>
-                <w:b/>
-                <w:bCs/>
-                <w:sz w:val="18"/>
-                <w:szCs w:val="18"/>
+                <w:sz w:val="16"/>
+                <w:szCs w:val="16"/>
+              </w:rPr>
+            </w:pPr>
+            <w:r>
+              <w:rPr>
+                <w:rFonts w:ascii="Arial" w:hAnsi="Arial" w:cs="Arial"/>
+                <w:b/>
+                <w:bCs/>
+                <w:sz w:val="16"/>
+                <w:szCs w:val="16"/>
               </w:rPr>
               <w:t>Abertura de Análise de causa?</w:t>
             </w:r>
@@ -1295,8 +1380,8 @@
                 <w:rFonts w:ascii="Arial" w:hAnsi="Arial" w:cs="Arial"/>
                 <w:b/>
                 <w:bCs/>
-                <w:sz w:val="18"/>
-                <w:szCs w:val="18"/>
+                <w:sz w:val="16"/>
+                <w:szCs w:val="16"/>
               </w:rPr>
             </w:pPr>
           </w:p>
@@ -1321,17 +1406,17 @@
                 <w:rFonts w:ascii="Arial" w:hAnsi="Arial" w:cs="Arial"/>
                 <w:b/>
                 <w:bCs/>
-                <w:sz w:val="18"/>
-                <w:szCs w:val="18"/>
-              </w:rPr>
-            </w:pPr>
-            <w:r>
-              <w:rPr>
-                <w:rFonts w:ascii="Arial" w:hAnsi="Arial" w:cs="Arial"/>
-                <w:b/>
-                <w:bCs/>
-                <w:sz w:val="18"/>
-                <w:szCs w:val="18"/>
+                <w:sz w:val="16"/>
+                <w:szCs w:val="16"/>
+              </w:rPr>
+            </w:pPr>
+            <w:r>
+              <w:rPr>
+                <w:rFonts w:ascii="Arial" w:hAnsi="Arial" w:cs="Arial"/>
+                <w:b/>
+                <w:bCs/>
+                <w:sz w:val="16"/>
+                <w:szCs w:val="16"/>
               </w:rPr>
               <w:t>ANÁLISE DA CAUSA</w:t>
             </w:r>
@@ -1357,8 +1442,8 @@
                 <w:rFonts w:ascii="Arial" w:hAnsi="Arial" w:cs="Arial"/>
                 <w:b/>
                 <w:bCs/>
-                <w:sz w:val="18"/>
-                <w:szCs w:val="18"/>
+                <w:sz w:val="16"/>
+                <w:szCs w:val="16"/>
               </w:rPr>
             </w:pPr>
             <w:proofErr w:type="gramStart"/>
@@ -1367,8 +1452,8 @@
                 <w:rFonts w:ascii="Arial" w:hAnsi="Arial" w:cs="Arial"/>
                 <w:b/>
                 <w:bCs/>
-                <w:sz w:val="18"/>
-                <w:szCs w:val="18"/>
+                <w:sz w:val="16"/>
+                <w:szCs w:val="16"/>
               </w:rPr>
               <w:t>Porquê</w:t>
             </w:r>
@@ -1378,8 +1463,8 @@
                 <w:rFonts w:ascii="Arial" w:hAnsi="Arial" w:cs="Arial"/>
                 <w:b/>
                 <w:bCs/>
-                <w:sz w:val="18"/>
-                <w:szCs w:val="18"/>
+                <w:sz w:val="16"/>
+                <w:szCs w:val="16"/>
               </w:rPr>
               <w:t>? (1)</w:t>
             </w:r>
@@ -1392,8 +1477,8 @@
                 <w:rFonts w:ascii="Arial" w:hAnsi="Arial" w:cs="Arial"/>
                 <w:b/>
                 <w:bCs/>
-                <w:sz w:val="18"/>
-                <w:szCs w:val="18"/>
+                <w:sz w:val="16"/>
+                <w:szCs w:val="16"/>
               </w:rPr>
             </w:pPr>
           </w:p>
@@ -1413,8 +1498,8 @@
                 <w:rFonts w:ascii="Arial" w:hAnsi="Arial" w:cs="Arial"/>
                 <w:b/>
                 <w:bCs/>
-                <w:sz w:val="18"/>
-                <w:szCs w:val="18"/>
+                <w:sz w:val="16"/>
+                <w:szCs w:val="16"/>
               </w:rPr>
             </w:pPr>
           </w:p>
@@ -1439,8 +1524,8 @@
                 <w:rFonts w:ascii="Arial" w:hAnsi="Arial" w:cs="Arial"/>
                 <w:b/>
                 <w:bCs/>
-                <w:sz w:val="18"/>
-                <w:szCs w:val="18"/>
+                <w:sz w:val="16"/>
+                <w:szCs w:val="16"/>
               </w:rPr>
             </w:pPr>
             <w:proofErr w:type="gramStart"/>
@@ -1449,8 +1534,8 @@
                 <w:rFonts w:ascii="Arial" w:hAnsi="Arial" w:cs="Arial"/>
                 <w:b/>
                 <w:bCs/>
-                <w:sz w:val="18"/>
-                <w:szCs w:val="18"/>
+                <w:sz w:val="16"/>
+                <w:szCs w:val="16"/>
               </w:rPr>
               <w:t>Porquê</w:t>
             </w:r>
@@ -1460,8 +1545,8 @@
                 <w:rFonts w:ascii="Arial" w:hAnsi="Arial" w:cs="Arial"/>
                 <w:b/>
                 <w:bCs/>
-                <w:sz w:val="18"/>
-                <w:szCs w:val="18"/>
+                <w:sz w:val="16"/>
+                <w:szCs w:val="16"/>
               </w:rPr>
               <w:t>? (2)</w:t>
             </w:r>
@@ -1474,8 +1559,8 @@
                 <w:rFonts w:ascii="Arial" w:hAnsi="Arial" w:cs="Arial"/>
                 <w:b/>
                 <w:bCs/>
-                <w:sz w:val="18"/>
-                <w:szCs w:val="18"/>
+                <w:sz w:val="16"/>
+                <w:szCs w:val="16"/>
               </w:rPr>
             </w:pPr>
           </w:p>
@@ -1495,8 +1580,8 @@
                 <w:rFonts w:ascii="Arial" w:hAnsi="Arial" w:cs="Arial"/>
                 <w:b/>
                 <w:bCs/>
-                <w:sz w:val="18"/>
-                <w:szCs w:val="18"/>
+                <w:sz w:val="16"/>
+                <w:szCs w:val="16"/>
               </w:rPr>
             </w:pPr>
           </w:p>
@@ -1521,8 +1606,8 @@
                 <w:rFonts w:ascii="Arial" w:hAnsi="Arial" w:cs="Arial"/>
                 <w:b/>
                 <w:bCs/>
-                <w:sz w:val="18"/>
-                <w:szCs w:val="18"/>
+                <w:sz w:val="16"/>
+                <w:szCs w:val="16"/>
               </w:rPr>
             </w:pPr>
             <w:proofErr w:type="gramStart"/>
@@ -1531,8 +1616,8 @@
                 <w:rFonts w:ascii="Arial" w:hAnsi="Arial" w:cs="Arial"/>
                 <w:b/>
                 <w:bCs/>
-                <w:sz w:val="18"/>
-                <w:szCs w:val="18"/>
+                <w:sz w:val="16"/>
+                <w:szCs w:val="16"/>
               </w:rPr>
               <w:t>Porquê</w:t>
             </w:r>
@@ -1542,8 +1627,8 @@
                 <w:rFonts w:ascii="Arial" w:hAnsi="Arial" w:cs="Arial"/>
                 <w:b/>
                 <w:bCs/>
-                <w:sz w:val="18"/>
-                <w:szCs w:val="18"/>
+                <w:sz w:val="16"/>
+                <w:szCs w:val="16"/>
               </w:rPr>
               <w:t>? (3)</w:t>
             </w:r>
@@ -1556,8 +1641,8 @@
                 <w:rFonts w:ascii="Arial" w:hAnsi="Arial" w:cs="Arial"/>
                 <w:b/>
                 <w:bCs/>
-                <w:sz w:val="18"/>
-                <w:szCs w:val="18"/>
+                <w:sz w:val="16"/>
+                <w:szCs w:val="16"/>
               </w:rPr>
             </w:pPr>
           </w:p>
@@ -1577,8 +1662,8 @@
                 <w:rFonts w:ascii="Arial" w:hAnsi="Arial" w:cs="Arial"/>
                 <w:b/>
                 <w:bCs/>
-                <w:sz w:val="18"/>
-                <w:szCs w:val="18"/>
+                <w:sz w:val="16"/>
+                <w:szCs w:val="16"/>
               </w:rPr>
             </w:pPr>
           </w:p>
@@ -1603,8 +1688,8 @@
                 <w:rFonts w:ascii="Arial" w:hAnsi="Arial" w:cs="Arial"/>
                 <w:b/>
                 <w:bCs/>
-                <w:sz w:val="18"/>
-                <w:szCs w:val="18"/>
+                <w:sz w:val="16"/>
+                <w:szCs w:val="16"/>
               </w:rPr>
             </w:pPr>
             <w:proofErr w:type="gramStart"/>
@@ -1613,8 +1698,8 @@
                 <w:rFonts w:ascii="Arial" w:hAnsi="Arial" w:cs="Arial"/>
                 <w:b/>
                 <w:bCs/>
-                <w:sz w:val="18"/>
-                <w:szCs w:val="18"/>
+                <w:sz w:val="16"/>
+                <w:szCs w:val="16"/>
               </w:rPr>
               <w:t>Porquê</w:t>
             </w:r>
@@ -1624,8 +1709,8 @@
                 <w:rFonts w:ascii="Arial" w:hAnsi="Arial" w:cs="Arial"/>
                 <w:b/>
                 <w:bCs/>
-                <w:sz w:val="18"/>
-                <w:szCs w:val="18"/>
+                <w:sz w:val="16"/>
+                <w:szCs w:val="16"/>
               </w:rPr>
               <w:t>? (4)</w:t>
             </w:r>
@@ -1638,17 +1723,17 @@
                 <w:rFonts w:ascii="Arial" w:hAnsi="Arial" w:cs="Arial"/>
                 <w:b/>
                 <w:bCs/>
-                <w:sz w:val="18"/>
-                <w:szCs w:val="18"/>
-              </w:rPr>
-            </w:pPr>
-            <w:r>
-              <w:rPr>
-                <w:rFonts w:ascii="Arial" w:hAnsi="Arial" w:cs="Arial"/>
-                <w:b/>
-                <w:bCs/>
-                <w:sz w:val="18"/>
-                <w:szCs w:val="18"/>
+                <w:sz w:val="16"/>
+                <w:szCs w:val="16"/>
+              </w:rPr>
+            </w:pPr>
+            <w:r>
+              <w:rPr>
+                <w:rFonts w:ascii="Arial" w:hAnsi="Arial" w:cs="Arial"/>
+                <w:b/>
+                <w:bCs/>
+                <w:sz w:val="16"/>
+                <w:szCs w:val="16"/>
               </w:rPr>
               <w:tab/>
             </w:r>
@@ -1669,8 +1754,8 @@
                 <w:rFonts w:ascii="Arial" w:hAnsi="Arial" w:cs="Arial"/>
                 <w:b/>
                 <w:bCs/>
-                <w:sz w:val="18"/>
-                <w:szCs w:val="18"/>
+                <w:sz w:val="16"/>
+                <w:szCs w:val="16"/>
               </w:rPr>
             </w:pPr>
           </w:p>
@@ -1695,8 +1780,8 @@
                 <w:rFonts w:ascii="Arial" w:hAnsi="Arial" w:cs="Arial"/>
                 <w:b/>
                 <w:bCs/>
-                <w:sz w:val="18"/>
-                <w:szCs w:val="18"/>
+                <w:sz w:val="16"/>
+                <w:szCs w:val="16"/>
               </w:rPr>
             </w:pPr>
             <w:proofErr w:type="gramStart"/>
@@ -1705,8 +1790,8 @@
                 <w:rFonts w:ascii="Arial" w:hAnsi="Arial" w:cs="Arial"/>
                 <w:b/>
                 <w:bCs/>
-                <w:sz w:val="18"/>
-                <w:szCs w:val="18"/>
+                <w:sz w:val="16"/>
+                <w:szCs w:val="16"/>
               </w:rPr>
               <w:t>Porquê</w:t>
             </w:r>
@@ -1716,8 +1801,8 @@
                 <w:rFonts w:ascii="Arial" w:hAnsi="Arial" w:cs="Arial"/>
                 <w:b/>
                 <w:bCs/>
-                <w:sz w:val="18"/>
-                <w:szCs w:val="18"/>
+                <w:sz w:val="16"/>
+                <w:szCs w:val="16"/>
               </w:rPr>
               <w:t>? (5)</w:t>
             </w:r>
@@ -1730,8 +1815,8 @@
                 <w:rFonts w:ascii="Arial" w:hAnsi="Arial" w:cs="Arial"/>
                 <w:b/>
                 <w:bCs/>
-                <w:sz w:val="18"/>
-                <w:szCs w:val="18"/>
+                <w:sz w:val="16"/>
+                <w:szCs w:val="16"/>
               </w:rPr>
             </w:pPr>
           </w:p>
@@ -1751,8 +1836,8 @@
                 <w:rFonts w:ascii="Arial" w:hAnsi="Arial" w:cs="Arial"/>
                 <w:b/>
                 <w:bCs/>
-                <w:sz w:val="18"/>
-                <w:szCs w:val="18"/>
+                <w:sz w:val="16"/>
+                <w:szCs w:val="16"/>
               </w:rPr>
             </w:pPr>
           </w:p>
@@ -1777,17 +1862,17 @@
                 <w:rFonts w:ascii="Arial" w:hAnsi="Arial" w:cs="Arial"/>
                 <w:b/>
                 <w:bCs/>
-                <w:sz w:val="18"/>
-                <w:szCs w:val="18"/>
-              </w:rPr>
-            </w:pPr>
-            <w:r>
-              <w:rPr>
-                <w:rFonts w:ascii="Arial" w:hAnsi="Arial" w:cs="Arial"/>
-                <w:b/>
-                <w:bCs/>
-                <w:sz w:val="18"/>
-                <w:szCs w:val="18"/>
+                <w:sz w:val="16"/>
+                <w:szCs w:val="16"/>
+              </w:rPr>
+            </w:pPr>
+            <w:r>
+              <w:rPr>
+                <w:rFonts w:ascii="Arial" w:hAnsi="Arial" w:cs="Arial"/>
+                <w:b/>
+                <w:bCs/>
+                <w:sz w:val="16"/>
+                <w:szCs w:val="16"/>
               </w:rPr>
               <w:t>Causa Raiz</w:t>
             </w:r>
@@ -1800,8 +1885,8 @@
                 <w:rFonts w:ascii="Arial" w:hAnsi="Arial" w:cs="Arial"/>
                 <w:b/>
                 <w:bCs/>
-                <w:sz w:val="18"/>
-                <w:szCs w:val="18"/>
+                <w:sz w:val="16"/>
+                <w:szCs w:val="16"/>
               </w:rPr>
             </w:pPr>
           </w:p>
@@ -1821,8 +1906,8 @@
                 <w:rFonts w:ascii="Arial" w:hAnsi="Arial" w:cs="Arial"/>
                 <w:b/>
                 <w:bCs/>
-                <w:sz w:val="18"/>
-                <w:szCs w:val="18"/>
+                <w:sz w:val="16"/>
+                <w:szCs w:val="16"/>
               </w:rPr>
             </w:pPr>
           </w:p>
@@ -1847,17 +1932,17 @@
                 <w:rFonts w:ascii="Arial" w:hAnsi="Arial" w:cs="Arial"/>
                 <w:b/>
                 <w:bCs/>
-                <w:sz w:val="18"/>
-                <w:szCs w:val="18"/>
-              </w:rPr>
-            </w:pPr>
-            <w:r>
-              <w:rPr>
-                <w:rFonts w:ascii="Arial" w:hAnsi="Arial" w:cs="Arial"/>
-                <w:b/>
-                <w:bCs/>
-                <w:sz w:val="18"/>
-                <w:szCs w:val="18"/>
+                <w:sz w:val="16"/>
+                <w:szCs w:val="16"/>
+              </w:rPr>
+            </w:pPr>
+            <w:r>
+              <w:rPr>
+                <w:rFonts w:ascii="Arial" w:hAnsi="Arial" w:cs="Arial"/>
+                <w:b/>
+                <w:bCs/>
+                <w:sz w:val="16"/>
+                <w:szCs w:val="16"/>
               </w:rPr>
               <w:t>Ação 1</w:t>
             </w:r>
@@ -1870,8 +1955,8 @@
                 <w:rFonts w:ascii="Arial" w:hAnsi="Arial" w:cs="Arial"/>
                 <w:b/>
                 <w:bCs/>
-                <w:sz w:val="18"/>
-                <w:szCs w:val="18"/>
+                <w:sz w:val="16"/>
+                <w:szCs w:val="16"/>
               </w:rPr>
             </w:pPr>
           </w:p>
@@ -1891,8 +1976,8 @@
                 <w:rFonts w:ascii="Arial" w:hAnsi="Arial" w:cs="Arial"/>
                 <w:b/>
                 <w:bCs/>
-                <w:sz w:val="18"/>
-                <w:szCs w:val="18"/>
+                <w:sz w:val="16"/>
+                <w:szCs w:val="16"/>
               </w:rPr>
             </w:pPr>
           </w:p>
@@ -1912,8 +1997,8 @@
                 <w:rFonts w:ascii="Arial" w:hAnsi="Arial" w:cs="Arial"/>
                 <w:b/>
                 <w:bCs/>
-                <w:sz w:val="18"/>
-                <w:szCs w:val="18"/>
+                <w:sz w:val="16"/>
+                <w:szCs w:val="16"/>
               </w:rPr>
             </w:pPr>
             <w:r>
@@ -1922,8 +2007,8 @@
                 <w:b/>
                 <w:bCs/>
                 <w:i/>
-                <w:sz w:val="18"/>
-                <w:szCs w:val="18"/>
+                <w:sz w:val="16"/>
+                <w:szCs w:val="16"/>
               </w:rPr>
               <w:t>Responsável</w:t>
             </w:r>
@@ -1944,8 +2029,8 @@
                 <w:rFonts w:ascii="Arial" w:hAnsi="Arial" w:cs="Arial"/>
                 <w:b/>
                 <w:bCs/>
-                <w:sz w:val="18"/>
-                <w:szCs w:val="18"/>
+                <w:sz w:val="16"/>
+                <w:szCs w:val="16"/>
               </w:rPr>
             </w:pPr>
           </w:p>
@@ -1965,8 +2050,8 @@
                 <w:rFonts w:ascii="Arial" w:hAnsi="Arial" w:cs="Arial"/>
                 <w:b/>
                 <w:bCs/>
-                <w:sz w:val="18"/>
-                <w:szCs w:val="18"/>
+                <w:sz w:val="16"/>
+                <w:szCs w:val="16"/>
               </w:rPr>
             </w:pPr>
             <w:r>
@@ -1975,8 +2060,8 @@
                 <w:b/>
                 <w:bCs/>
                 <w:i/>
-                <w:sz w:val="18"/>
-                <w:szCs w:val="18"/>
+                <w:sz w:val="16"/>
+                <w:szCs w:val="16"/>
               </w:rPr>
               <w:t>Prazo de entrega</w:t>
             </w:r>
@@ -1996,8 +2081,8 @@
                 <w:rFonts w:ascii="Arial" w:hAnsi="Arial" w:cs="Arial"/>
                 <w:b/>
                 <w:bCs/>
-                <w:sz w:val="18"/>
-                <w:szCs w:val="18"/>
+                <w:sz w:val="16"/>
+                <w:szCs w:val="16"/>
               </w:rPr>
             </w:pPr>
           </w:p>
@@ -2022,17 +2107,17 @@
                 <w:rFonts w:ascii="Arial" w:hAnsi="Arial" w:cs="Arial"/>
                 <w:b/>
                 <w:bCs/>
-                <w:sz w:val="18"/>
-                <w:szCs w:val="18"/>
-              </w:rPr>
-            </w:pPr>
-            <w:r>
-              <w:rPr>
-                <w:rFonts w:ascii="Arial" w:hAnsi="Arial" w:cs="Arial"/>
-                <w:b/>
-                <w:bCs/>
-                <w:sz w:val="18"/>
-                <w:szCs w:val="18"/>
+                <w:sz w:val="16"/>
+                <w:szCs w:val="16"/>
+              </w:rPr>
+            </w:pPr>
+            <w:r>
+              <w:rPr>
+                <w:rFonts w:ascii="Arial" w:hAnsi="Arial" w:cs="Arial"/>
+                <w:b/>
+                <w:bCs/>
+                <w:sz w:val="16"/>
+                <w:szCs w:val="16"/>
               </w:rPr>
               <w:t>Ação 2</w:t>
             </w:r>
@@ -2045,8 +2130,8 @@
                 <w:rFonts w:ascii="Arial" w:hAnsi="Arial" w:cs="Arial"/>
                 <w:b/>
                 <w:bCs/>
-                <w:sz w:val="18"/>
-                <w:szCs w:val="18"/>
+                <w:sz w:val="16"/>
+                <w:szCs w:val="16"/>
               </w:rPr>
             </w:pPr>
           </w:p>
@@ -2066,8 +2151,8 @@
                 <w:rFonts w:ascii="Arial" w:hAnsi="Arial" w:cs="Arial"/>
                 <w:b/>
                 <w:bCs/>
-                <w:sz w:val="18"/>
-                <w:szCs w:val="18"/>
+                <w:sz w:val="16"/>
+                <w:szCs w:val="16"/>
               </w:rPr>
             </w:pPr>
           </w:p>
@@ -2087,8 +2172,8 @@
                 <w:rFonts w:ascii="Arial" w:hAnsi="Arial" w:cs="Arial"/>
                 <w:b/>
                 <w:bCs/>
-                <w:sz w:val="18"/>
-                <w:szCs w:val="18"/>
+                <w:sz w:val="16"/>
+                <w:szCs w:val="16"/>
               </w:rPr>
             </w:pPr>
             <w:r>
@@ -2097,8 +2182,8 @@
                 <w:b/>
                 <w:bCs/>
                 <w:i/>
-                <w:sz w:val="18"/>
-                <w:szCs w:val="18"/>
+                <w:sz w:val="16"/>
+                <w:szCs w:val="16"/>
               </w:rPr>
               <w:t>Responsável</w:t>
             </w:r>
@@ -2119,8 +2204,8 @@
                 <w:rFonts w:ascii="Arial" w:hAnsi="Arial" w:cs="Arial"/>
                 <w:b/>
                 <w:bCs/>
-                <w:sz w:val="18"/>
-                <w:szCs w:val="18"/>
+                <w:sz w:val="16"/>
+                <w:szCs w:val="16"/>
               </w:rPr>
             </w:pPr>
           </w:p>
@@ -2140,8 +2225,8 @@
                 <w:rFonts w:ascii="Arial" w:hAnsi="Arial" w:cs="Arial"/>
                 <w:b/>
                 <w:bCs/>
-                <w:sz w:val="18"/>
-                <w:szCs w:val="18"/>
+                <w:sz w:val="16"/>
+                <w:szCs w:val="16"/>
               </w:rPr>
             </w:pPr>
             <w:r>
@@ -2150,8 +2235,8 @@
                 <w:b/>
                 <w:bCs/>
                 <w:i/>
-                <w:sz w:val="18"/>
-                <w:szCs w:val="18"/>
+                <w:sz w:val="16"/>
+                <w:szCs w:val="16"/>
               </w:rPr>
               <w:t>Prazo de entrega</w:t>
             </w:r>
@@ -2171,8 +2256,8 @@
                 <w:rFonts w:ascii="Arial" w:hAnsi="Arial" w:cs="Arial"/>
                 <w:b/>
                 <w:bCs/>
-                <w:sz w:val="18"/>
-                <w:szCs w:val="18"/>
+                <w:sz w:val="16"/>
+                <w:szCs w:val="16"/>
               </w:rPr>
             </w:pPr>
           </w:p>
@@ -2197,17 +2282,17 @@
                 <w:rFonts w:ascii="Arial" w:hAnsi="Arial" w:cs="Arial"/>
                 <w:b/>
                 <w:bCs/>
-                <w:sz w:val="18"/>
-                <w:szCs w:val="18"/>
-              </w:rPr>
-            </w:pPr>
-            <w:r>
-              <w:rPr>
-                <w:rFonts w:ascii="Arial" w:hAnsi="Arial" w:cs="Arial"/>
-                <w:b/>
-                <w:bCs/>
-                <w:sz w:val="18"/>
-                <w:szCs w:val="18"/>
+                <w:sz w:val="16"/>
+                <w:szCs w:val="16"/>
+              </w:rPr>
+            </w:pPr>
+            <w:r>
+              <w:rPr>
+                <w:rFonts w:ascii="Arial" w:hAnsi="Arial" w:cs="Arial"/>
+                <w:b/>
+                <w:bCs/>
+                <w:sz w:val="16"/>
+                <w:szCs w:val="16"/>
               </w:rPr>
               <w:t>Ação 3</w:t>
             </w:r>
@@ -2220,8 +2305,8 @@
                 <w:rFonts w:ascii="Arial" w:hAnsi="Arial" w:cs="Arial"/>
                 <w:b/>
                 <w:bCs/>
-                <w:sz w:val="18"/>
-                <w:szCs w:val="18"/>
+                <w:sz w:val="16"/>
+                <w:szCs w:val="16"/>
               </w:rPr>
             </w:pPr>
           </w:p>
@@ -2241,8 +2326,8 @@
                 <w:rFonts w:ascii="Arial" w:hAnsi="Arial" w:cs="Arial"/>
                 <w:b/>
                 <w:bCs/>
-                <w:sz w:val="18"/>
-                <w:szCs w:val="18"/>
+                <w:sz w:val="16"/>
+                <w:szCs w:val="16"/>
               </w:rPr>
             </w:pPr>
           </w:p>
@@ -2262,8 +2347,8 @@
                 <w:rFonts w:ascii="Arial" w:hAnsi="Arial" w:cs="Arial"/>
                 <w:b/>
                 <w:bCs/>
-                <w:sz w:val="18"/>
-                <w:szCs w:val="18"/>
+                <w:sz w:val="16"/>
+                <w:szCs w:val="16"/>
               </w:rPr>
             </w:pPr>
             <w:r>
@@ -2272,8 +2357,8 @@
                 <w:b/>
                 <w:bCs/>
                 <w:i/>
-                <w:sz w:val="18"/>
-                <w:szCs w:val="18"/>
+                <w:sz w:val="16"/>
+                <w:szCs w:val="16"/>
               </w:rPr>
               <w:t>Responsável</w:t>
             </w:r>
@@ -2294,8 +2379,8 @@
                 <w:rFonts w:ascii="Arial" w:hAnsi="Arial" w:cs="Arial"/>
                 <w:b/>
                 <w:bCs/>
-                <w:sz w:val="18"/>
-                <w:szCs w:val="18"/>
+                <w:sz w:val="16"/>
+                <w:szCs w:val="16"/>
               </w:rPr>
             </w:pPr>
           </w:p>
@@ -2315,8 +2400,8 @@
                 <w:rFonts w:ascii="Arial" w:hAnsi="Arial" w:cs="Arial"/>
                 <w:b/>
                 <w:bCs/>
-                <w:sz w:val="18"/>
-                <w:szCs w:val="18"/>
+                <w:sz w:val="16"/>
+                <w:szCs w:val="16"/>
               </w:rPr>
             </w:pPr>
             <w:r>
@@ -2325,8 +2410,8 @@
                 <w:b/>
                 <w:bCs/>
                 <w:i/>
-                <w:sz w:val="18"/>
-                <w:szCs w:val="18"/>
+                <w:sz w:val="16"/>
+                <w:szCs w:val="16"/>
               </w:rPr>
               <w:t>Prazo de entrega</w:t>
             </w:r>
@@ -2346,8 +2431,8 @@
                 <w:rFonts w:ascii="Arial" w:hAnsi="Arial" w:cs="Arial"/>
                 <w:b/>
                 <w:bCs/>
-                <w:sz w:val="18"/>
-                <w:szCs w:val="18"/>
+                <w:sz w:val="16"/>
+                <w:szCs w:val="16"/>
               </w:rPr>
             </w:pPr>
           </w:p>
@@ -2372,17 +2457,17 @@
                 <w:rFonts w:ascii="Arial" w:hAnsi="Arial" w:cs="Arial"/>
                 <w:b/>
                 <w:bCs/>
-                <w:sz w:val="18"/>
-                <w:szCs w:val="18"/>
-              </w:rPr>
-            </w:pPr>
-            <w:r>
-              <w:rPr>
-                <w:rFonts w:ascii="Arial" w:hAnsi="Arial" w:cs="Arial"/>
-                <w:b/>
-                <w:bCs/>
-                <w:sz w:val="18"/>
-                <w:szCs w:val="18"/>
+                <w:sz w:val="16"/>
+                <w:szCs w:val="16"/>
+              </w:rPr>
+            </w:pPr>
+            <w:r>
+              <w:rPr>
+                <w:rFonts w:ascii="Arial" w:hAnsi="Arial" w:cs="Arial"/>
+                <w:b/>
+                <w:bCs/>
+                <w:sz w:val="16"/>
+                <w:szCs w:val="16"/>
               </w:rPr>
               <w:t>Análise Eficaz?</w:t>
             </w:r>
@@ -2403,21 +2488,14 @@
                 <w:rFonts w:ascii="Arial" w:hAnsi="Arial" w:cs="Arial"/>
                 <w:b/>
                 <w:bCs/>
-                <w:sz w:val="18"/>
-                <w:szCs w:val="18"/>
+                <w:sz w:val="16"/>
+                <w:szCs w:val="16"/>
               </w:rPr>
             </w:pPr>
           </w:p>
         </w:tc>
       </w:tr>
     </w:tbl>
-    <w:p>
-      <w:pPr>
-        <w:rPr>
-          <w:b/>
-        </w:rPr>
-      </w:pPr>
-    </w:p>
     <w:sectPr>
       <w:headerReference w:type="even" r:id="rId7"/>
       <w:headerReference w:type="default" r:id="rId8"/>
@@ -3284,13 +3362,14 @@
     <w:name w:val="Normal"/>
     <w:qFormat/>
     <w:rPr>
-      <w:sz w:val="24"/>
-      <w:szCs w:val="24"/>
+      <w:sz w:val="16"/>
+      <w:szCs w:val="16"/>
     </w:rPr>
   </w:style>
   <w:style w:type="character" w:default="1" w:styleId="Fontepargpadro">
     <w:name w:val="Default Paragraph Font"/>
     <w:uiPriority w:val="1"/>
+    <w:semiHidden/>
     <w:unhideWhenUsed/>
   </w:style>
   <w:style w:type="table" w:default="1" w:styleId="Tabelanormal">
@@ -3357,8 +3436,8 @@
     <w:uiPriority w:val="99"/>
     <w:rsid w:val="005C784D"/>
     <w:rPr>
-      <w:sz w:val="24"/>
-      <w:szCs w:val="24"/>
+      <w:sz w:val="16"/>
+      <w:szCs w:val="16"/>
     </w:rPr>
   </w:style>
   <w:style w:type="paragraph" w:styleId="Rodap">
@@ -3381,8 +3460,8 @@
     <w:uiPriority w:val="99"/>
     <w:rsid w:val="005C784D"/>
     <w:rPr>
-      <w:sz w:val="24"/>
-      <w:szCs w:val="24"/>
+      <w:sz w:val="16"/>
+      <w:szCs w:val="16"/>
     </w:rPr>
   </w:style>
   <w:style w:type="paragraph" w:styleId="Textodebalo">
@@ -3431,8 +3510,8 @@
     <w:unhideWhenUsed/>
     <w:rsid w:val="00C67204"/>
     <w:rPr>
-      <w:sz w:val="20"/>
-      <w:szCs w:val="20"/>
+      <w:sz w:val="16"/>
+      <w:szCs w:val="16"/>
     </w:rPr>
   </w:style>
   <w:style w:type="character" w:customStyle="1" w:styleId="TextodecomentrioChar">

</xml_diff>